<commit_message>
Fixed Bug in CheckConnectivity Service and Offline Activity
</commit_message>
<xml_diff>
--- a/Unreal Furniture.docx
+++ b/Unreal Furniture.docx
@@ -2808,6 +2808,12 @@
           <w:rFonts w:ascii="Times New Roman" w:hAnsi="Times New Roman" w:cs="Times New Roman"/>
         </w:rPr>
         <w:t>by offering ready-to-use tools and infrastructure for building high-quality applications.</w:t>
+      </w:r>
+      <w:r>
+        <w:rPr>
+          <w:rFonts w:ascii="Times New Roman" w:hAnsi="Times New Roman" w:cs="Times New Roman"/>
+        </w:rPr>
+        <w:t>’</w:t>
       </w:r>
     </w:p>
     <w:p>

</xml_diff>